<commit_message>
feat: rename Priora project to AuthSignal
</commit_message>
<xml_diff>
--- a/docs/Final_Report.docx
+++ b/docs/Final_Report.docx
@@ -344,7 +344,7 @@
       </w:r>
       <w:proofErr w:type="spellStart"/>
       <w:r>
-        <w:t>Priora</w:t>
+        <w:t>AuthSignal</w:t>
       </w:r>
       <w:proofErr w:type="spellEnd"/>
       <w:r>
@@ -545,7 +545,7 @@
       </w:r>
       <w:proofErr w:type="spellStart"/>
       <w:r>
-        <w:t>Priora</w:t>
+        <w:t>AuthSignal</w:t>
       </w:r>
       <w:proofErr w:type="spellEnd"/>
       <w:r>
@@ -628,7 +628,7 @@
         <w:rPr>
           <w:lang w:val="en-PK"/>
         </w:rPr>
-        <w:t>Priora</w:t>
+        <w:t>AuthSignal</w:t>
       </w:r>
       <w:proofErr w:type="spellEnd"/>
       <w:r>

</xml_diff>